<commit_message>
Fix the heel lift check, steady the skeleton and add the evaluation
The skeleton was jumping around on the analysed video. Bad frames are
now thrown out before the smoothing instead of being smoothed into it,
which is what analysis/stabilise.py does. The overlay itself is drawn
thinner and the far side is faded instead of hidden.

The squat heel check was firing on clean reps. Three reasons: the
threshold sat inside its own noise band, the standing baseline was
measured while I was still walking into position, and the rule passed
itself when it had no evidence. All three are fixed and the threshold
is 0.16 of the lower leg now.

Ran the 14 clips I filmed through scripts/evaluate_videos.py and wrote
up what it found in docs/evaluation_results.md, including the things it
got wrong. Docs, the docx files and the text on the analyse page are
updated to match.
</commit_message>
<xml_diff>
--- a/docs/FormFix_Overview.docx
+++ b/docs/FormFix_Overview.docx
@@ -2559,7 +2559,7 @@
           <w:sz w:val="21"/>
           <w:szCs w:val="21"/>
         </w:rPr>
-        <w:t xml:space="preserve"> Over 600 automated tests run the full pipeline on synthetic videos with known faults, and noise or a value just under a threshold must not produce a finding.</w:t>
+        <w:t xml:space="preserve"> Over 700 automated tests run the full pipeline on synthetic videos with known faults, and noise or a value just under a threshold must not produce a finding.</w:t>
       </w:r>
     </w:p>
     <w:p>
@@ -2622,7 +2622,7 @@
                 <w:sz w:val="19"/>
                 <w:szCs w:val="19"/>
               </w:rPr>
-              <w:t xml:space="preserve"> there's been no user study and no evaluation on labelled real videos yet, so FormFix makes </w:t>
+              <w:t xml:space="preserve"> fourteen labelled videos have now been run through it, but that is one person in one session, so FormFix makes </w:t>
             </w:r>
             <w:r>
               <w:rPr>
@@ -2633,7 +2633,7 @@
                 <w:sz w:val="19"/>
                 <w:szCs w:val="19"/>
               </w:rPr>
-              <w:t xml:space="preserve">no accuracy claim and no claim that it improves anyone's technique</w:t>
+              <w:t xml:space="preserve">no accuracy claim. There has been no user study, and no claim that it improves anyone's technique</w:t>
             </w:r>
             <w:r>
               <w:rPr>

</xml_diff>